<commit_message>
Correct master profile: Senior Directory is a healthcare directory; log ticket-volume comfort
Josh corrected two facts: Senior Directory (BDR, 2012-2016) was an online
healthcare business directory, giving him genuine prior healthcare-industry
exposure, and high-volume ticket/call/queue work is not a personal concern
given his BDR/AE calling background. Both are now recorded in
master-profile.md so future tailoring picks them up automatically.

Re-tailored the Headway application against the corrected profile: added
Senior Directory to the resume, updated the cover letter's healthcare
framing, and moved the fit score from 56 (long shot) to 66 (solid stretch).

Co-Authored-By: Claude Sonnet 5 <noreply@anthropic.com>
Claude-Session: https://claude.ai/code/session_01UUTNhDEKkqfHCsStddFPAS
</commit_message>
<xml_diff>
--- a/applications/headway-customer-care-associate/resume.docx
+++ b/applications/headway-customer-care-associate/resume.docx
@@ -80,7 +80,7 @@
           <w:i w:val="0"/>
           <w:color w:val="1A1A1A"/>
         </w:rPr>
-        <w:t>Customer support professional with over a decade resolving technical and operational issues for SaaS and service-based customers across email, chat, and phone, guiding non-technical users through setup, troubleshooting, and problem resolution with patience and clear communication. Runs my own client-facing business today, which means I already operate with an owner's sense of accountability for every customer interaction.</w:t>
+        <w:t>Customer support professional with over a decade resolving technical and operational issues for SaaS and service-based customers across email, chat, and phone, guiding non-technical users through setup, troubleshooting, and problem resolution with patience and clear communication. Background includes prior healthcare-industry experience and high-volume daily outreach, plus running my own client-facing business today, which means I already operate with an owner's sense of accountability for every customer interaction.</w:t>
       </w:r>
     </w:p>
     <w:p>
@@ -303,30 +303,6 @@
           <w:i w:val="0"/>
           <w:color w:val="1A1A1A"/>
         </w:rPr>
-        <w:t>Developed scalable communication workflows and automated product-training sequences that reduced onboarding friction.</w:t>
-      </w:r>
-    </w:p>
-    <w:p>
-      <w:pPr>
-        <w:spacing w:after="30"/>
-        <w:ind w:left="259" w:hanging="259"/>
-      </w:pPr>
-      <w:r>
-        <w:rPr>
-          <w:rFonts w:ascii="Calibri" w:hAnsi="Calibri"/>
-          <w:b w:val="0"/>
-          <w:i w:val="0"/>
-          <w:color w:val="163A5F"/>
-        </w:rPr>
-        <w:t xml:space="preserve">•  </w:t>
-      </w:r>
-      <w:r>
-        <w:rPr>
-          <w:rFonts w:ascii="Calibri" w:hAnsi="Calibri"/>
-          <w:b w:val="0"/>
-          <w:i w:val="0"/>
-          <w:color w:val="1A1A1A"/>
-        </w:rPr>
         <w:t>Analyzed partner utilization and performance metrics to identify adoption gaps and recommend interventions that reduced churn.</w:t>
       </w:r>
     </w:p>
@@ -512,6 +488,84 @@
     </w:p>
     <w:p>
       <w:pPr>
+        <w:tabs>
+          <w:tab w:pos="10512" w:val="right"/>
+        </w:tabs>
+        <w:spacing w:before="80" w:after="20"/>
+      </w:pPr>
+      <w:r>
+        <w:rPr>
+          <w:rFonts w:ascii="Calibri" w:hAnsi="Calibri"/>
+          <w:b/>
+          <w:i w:val="0"/>
+          <w:color w:val="1A1A1A"/>
+          <w:sz w:val="21"/>
+        </w:rPr>
+        <w:t>Business Development Representative</w:t>
+      </w:r>
+      <w:r>
+        <w:rPr>
+          <w:rFonts w:ascii="Calibri" w:hAnsi="Calibri"/>
+          <w:b w:val="0"/>
+          <w:i w:val="0"/>
+          <w:color w:val="163A5F"/>
+          <w:sz w:val="21"/>
+        </w:rPr>
+        <w:t xml:space="preserve">  |  Senior Directory</w:t>
+      </w:r>
+      <w:r>
+        <w:rPr>
+          <w:rFonts w:ascii="Calibri" w:hAnsi="Calibri"/>
+          <w:b w:val="0"/>
+          <w:i w:val="0"/>
+          <w:color w:val="555555"/>
+          <w:sz w:val="18"/>
+        </w:rPr>
+        <w:tab/>
+        <w:t>2012 - 2016</w:t>
+      </w:r>
+    </w:p>
+    <w:p>
+      <w:pPr>
+        <w:spacing w:after="20"/>
+      </w:pPr>
+      <w:r>
+        <w:rPr>
+          <w:rFonts w:ascii="Calibri" w:hAnsi="Calibri"/>
+          <w:b w:val="0"/>
+          <w:i/>
+          <w:color w:val="555555"/>
+          <w:sz w:val="18"/>
+        </w:rPr>
+        <w:t>Denver, CO</w:t>
+      </w:r>
+    </w:p>
+    <w:p>
+      <w:pPr>
+        <w:spacing w:after="30"/>
+        <w:ind w:left="259" w:hanging="259"/>
+      </w:pPr>
+      <w:r>
+        <w:rPr>
+          <w:rFonts w:ascii="Calibri" w:hAnsi="Calibri"/>
+          <w:b w:val="0"/>
+          <w:i w:val="0"/>
+          <w:color w:val="163A5F"/>
+        </w:rPr>
+        <w:t xml:space="preserve">•  </w:t>
+      </w:r>
+      <w:r>
+        <w:rPr>
+          <w:rFonts w:ascii="Calibri" w:hAnsi="Calibri"/>
+          <w:b w:val="0"/>
+          <w:i w:val="0"/>
+          <w:color w:val="1A1A1A"/>
+        </w:rPr>
+        <w:t>Prospected and qualified leads for an online healthcare business directory, booking appointments for regional sales representatives and maintaining a steady flow of sales-ready meetings through high-volume daily outreach.</w:t>
+      </w:r>
+    </w:p>
+    <w:p>
+      <w:pPr>
         <w:spacing w:before="140" w:after="60"/>
         <w:pBdr>
           <w:bottom w:val="single" w:sz="6" w:space="2" w:color="163a5f"/>
@@ -586,7 +640,7 @@
           <w:i w:val="0"/>
           <w:color w:val="1A1A1A"/>
         </w:rPr>
-        <w:t xml:space="preserve">Tools &amp; Platforms:  </w:t>
+        <w:t xml:space="preserve">Tools &amp; Ownership:  </w:t>
       </w:r>
       <w:r>
         <w:rPr>
@@ -595,30 +649,7 @@
           <w:i w:val="0"/>
           <w:color w:val="1A1A1A"/>
         </w:rPr>
-        <w:t>Zendesk, Salesforce, HubSpot, GoHighLevel</w:t>
-      </w:r>
-    </w:p>
-    <w:p>
-      <w:pPr>
-        <w:spacing w:after="30"/>
-      </w:pPr>
-      <w:r>
-        <w:rPr>
-          <w:rFonts w:ascii="Calibri" w:hAnsi="Calibri"/>
-          <w:b/>
-          <w:i w:val="0"/>
-          <w:color w:val="1A1A1A"/>
-        </w:rPr>
-        <w:t xml:space="preserve">Ownership &amp; Adaptability:  </w:t>
-      </w:r>
-      <w:r>
-        <w:rPr>
-          <w:rFonts w:ascii="Calibri" w:hAnsi="Calibri"/>
-          <w:b w:val="0"/>
-          <w:i w:val="0"/>
-          <w:color w:val="1A1A1A"/>
-        </w:rPr>
-        <w:t>Self-Directed Ownership (Founder), Fast-Paced Environment Adaptability, Cross-Functional Collaboration, Continuous Learning</w:t>
+        <w:t>Zendesk, Salesforce, HubSpot, Self-Directed Ownership (Founder), Fast-Paced Environment Adaptability, Continuous Learning</w:t>
       </w:r>
     </w:p>
     <w:p>
@@ -685,20 +716,6 @@
           <w:color w:val="1A1A1A"/>
         </w:rPr>
         <w:t>Google Digital Marketing &amp; E-Commerce Professional Certificate - Google / Coursera (2024)</w:t>
-      </w:r>
-    </w:p>
-    <w:p>
-      <w:pPr>
-        <w:spacing w:after="30"/>
-      </w:pPr>
-      <w:r>
-        <w:rPr>
-          <w:rFonts w:ascii="Calibri" w:hAnsi="Calibri"/>
-          <w:b w:val="0"/>
-          <w:i w:val="0"/>
-          <w:color w:val="1A1A1A"/>
-        </w:rPr>
-        <w:t>Meta Ads Certification - Meta</w:t>
       </w:r>
     </w:p>
     <w:sectPr>

</xml_diff>